<commit_message>
feat: add WordReaderHelper for .docx parsing and disable exam import buttons until a file is selected
</commit_message>
<xml_diff>
--- a/templates/exam_import_template_mc.docx
+++ b/templates/exam_import_template_mc.docx
@@ -41,8 +41,8 @@
           <w:rFonts w:ascii="TH SarabunPSK" w:hAnsi="TH SarabunPSK" w:cs="TH SarabunPSK"/>
           <w:b/>
           <w:bCs/>
-          <w:sz w:val="32"/>
-          <w:szCs w:val="32"/>
+          <w:sz w:val="28"/>
+          <w:szCs w:val="28"/>
         </w:rPr>
       </w:pPr>
       <w:proofErr w:type="spellStart"/>
@@ -52,8 +52,8 @@
           <w:b/>
           <w:bCs/>
           <w:color w:val="595959"/>
-          <w:sz w:val="32"/>
-          <w:szCs w:val="32"/>
+          <w:sz w:val="28"/>
+          <w:szCs w:val="28"/>
         </w:rPr>
         <w:t>คำแนะนำ</w:t>
       </w:r>
@@ -64,8 +64,8 @@
           <w:b/>
           <w:bCs/>
           <w:color w:val="595959"/>
-          <w:sz w:val="32"/>
-          <w:szCs w:val="32"/>
+          <w:sz w:val="28"/>
+          <w:szCs w:val="28"/>
         </w:rPr>
         <w:t xml:space="preserve">: </w:t>
       </w:r>
@@ -76,8 +76,8 @@
           <w:b/>
           <w:bCs/>
           <w:color w:val="595959"/>
-          <w:sz w:val="32"/>
-          <w:szCs w:val="32"/>
+          <w:sz w:val="28"/>
+          <w:szCs w:val="28"/>
         </w:rPr>
         <w:t>พิมพ์โจทย์เรียงข้อ</w:t>
       </w:r>
@@ -88,8 +88,8 @@
           <w:b/>
           <w:bCs/>
           <w:color w:val="595959"/>
-          <w:sz w:val="32"/>
-          <w:szCs w:val="32"/>
+          <w:sz w:val="28"/>
+          <w:szCs w:val="28"/>
         </w:rPr>
         <w:t xml:space="preserve"> (1. 2. 3...) </w:t>
       </w:r>
@@ -100,8 +100,8 @@
           <w:b/>
           <w:bCs/>
           <w:color w:val="595959"/>
-          <w:sz w:val="32"/>
-          <w:szCs w:val="32"/>
+          <w:sz w:val="28"/>
+          <w:szCs w:val="28"/>
         </w:rPr>
         <w:t>ตามด้วยตัวเลือก</w:t>
       </w:r>
@@ -112,8 +112,8 @@
           <w:b/>
           <w:bCs/>
           <w:color w:val="595959"/>
-          <w:sz w:val="32"/>
-          <w:szCs w:val="32"/>
+          <w:sz w:val="28"/>
+          <w:szCs w:val="28"/>
         </w:rPr>
         <w:t xml:space="preserve"> (ก.-จ. </w:t>
       </w:r>
@@ -124,8 +124,8 @@
           <w:b/>
           <w:bCs/>
           <w:color w:val="595959"/>
-          <w:sz w:val="32"/>
-          <w:szCs w:val="32"/>
+          <w:sz w:val="28"/>
+          <w:szCs w:val="28"/>
         </w:rPr>
         <w:t>หรือ</w:t>
       </w:r>
@@ -136,8 +136,8 @@
           <w:b/>
           <w:bCs/>
           <w:color w:val="595959"/>
-          <w:sz w:val="32"/>
-          <w:szCs w:val="32"/>
+          <w:sz w:val="28"/>
+          <w:szCs w:val="28"/>
         </w:rPr>
         <w:t xml:space="preserve"> 1.-5.) </w:t>
       </w:r>
@@ -148,8 +148,8 @@
           <w:b/>
           <w:bCs/>
           <w:color w:val="595959"/>
-          <w:sz w:val="32"/>
-          <w:szCs w:val="32"/>
+          <w:sz w:val="28"/>
+          <w:szCs w:val="28"/>
         </w:rPr>
         <w:t>และใส่</w:t>
       </w:r>
@@ -160,8 +160,8 @@
           <w:b/>
           <w:bCs/>
           <w:color w:val="595959"/>
-          <w:sz w:val="32"/>
-          <w:szCs w:val="32"/>
+          <w:sz w:val="28"/>
+          <w:szCs w:val="28"/>
         </w:rPr>
         <w:t xml:space="preserve"> "</w:t>
       </w:r>
@@ -172,8 +172,8 @@
           <w:b/>
           <w:bCs/>
           <w:color w:val="595959"/>
-          <w:sz w:val="32"/>
-          <w:szCs w:val="32"/>
+          <w:sz w:val="28"/>
+          <w:szCs w:val="28"/>
         </w:rPr>
         <w:t>เฉลย</w:t>
       </w:r>
@@ -184,8 +184,8 @@
           <w:b/>
           <w:bCs/>
           <w:color w:val="595959"/>
-          <w:sz w:val="32"/>
-          <w:szCs w:val="32"/>
+          <w:sz w:val="28"/>
+          <w:szCs w:val="28"/>
         </w:rPr>
         <w:t xml:space="preserve">: ก" </w:t>
       </w:r>
@@ -196,8 +196,8 @@
           <w:b/>
           <w:bCs/>
           <w:color w:val="595959"/>
-          <w:sz w:val="32"/>
-          <w:szCs w:val="32"/>
+          <w:sz w:val="28"/>
+          <w:szCs w:val="28"/>
         </w:rPr>
         <w:t>หรือ</w:t>
       </w:r>
@@ -208,8 +208,8 @@
           <w:b/>
           <w:bCs/>
           <w:color w:val="595959"/>
-          <w:sz w:val="32"/>
-          <w:szCs w:val="32"/>
+          <w:sz w:val="28"/>
+          <w:szCs w:val="28"/>
         </w:rPr>
         <w:t xml:space="preserve"> "</w:t>
       </w:r>
@@ -220,8 +220,8 @@
           <w:b/>
           <w:bCs/>
           <w:color w:val="595959"/>
-          <w:sz w:val="32"/>
-          <w:szCs w:val="32"/>
+          <w:sz w:val="28"/>
+          <w:szCs w:val="28"/>
         </w:rPr>
         <w:t>เฉลย</w:t>
       </w:r>
@@ -232,8 +232,8 @@
           <w:b/>
           <w:bCs/>
           <w:color w:val="595959"/>
-          <w:sz w:val="32"/>
-          <w:szCs w:val="32"/>
+          <w:sz w:val="28"/>
+          <w:szCs w:val="28"/>
         </w:rPr>
         <w:t xml:space="preserve">: 1" </w:t>
       </w:r>
@@ -244,8 +244,8 @@
           <w:b/>
           <w:bCs/>
           <w:color w:val="595959"/>
-          <w:sz w:val="32"/>
-          <w:szCs w:val="32"/>
+          <w:sz w:val="28"/>
+          <w:szCs w:val="28"/>
         </w:rPr>
         <w:t>ในบรรทัดถัดไป</w:t>
       </w:r>
@@ -280,6 +280,7 @@
         <w:t xml:space="preserve">1. </w:t>
       </w:r>
       <w:proofErr w:type="spellStart"/>
+      <w:proofErr w:type="gramStart"/>
       <w:r>
         <w:rPr>
           <w:rFonts w:ascii="TH SarabunPSK" w:hAnsi="TH SarabunPSK" w:cs="TH SarabunPSK" w:hint="cs"/>
@@ -308,6 +309,7 @@
         </w:rPr>
         <w:t>?</w:t>
       </w:r>
+      <w:proofErr w:type="gramEnd"/>
     </w:p>
     <w:p>
       <w:pPr>
@@ -527,17 +529,27 @@
           <w:sz w:val="28"/>
           <w:szCs w:val="28"/>
         </w:rPr>
-        <w:t xml:space="preserve"> Server</w:t>
-      </w:r>
-      <w:r>
-        <w:rPr>
-          <w:rFonts w:ascii="TH SarabunPSK" w:hAnsi="TH SarabunPSK" w:cs="TH SarabunPSK"/>
-          <w:b/>
-          <w:sz w:val="28"/>
-          <w:szCs w:val="28"/>
-        </w:rPr>
         <w:t xml:space="preserve"> </w:t>
       </w:r>
+      <w:proofErr w:type="gramStart"/>
+      <w:r>
+        <w:rPr>
+          <w:rFonts w:ascii="TH SarabunPSK" w:hAnsi="TH SarabunPSK" w:cs="TH SarabunPSK" w:hint="cs"/>
+          <w:b/>
+          <w:sz w:val="28"/>
+          <w:szCs w:val="28"/>
+        </w:rPr>
+        <w:t>Server</w:t>
+      </w:r>
+      <w:r>
+        <w:rPr>
+          <w:rFonts w:ascii="TH SarabunPSK" w:hAnsi="TH SarabunPSK" w:cs="TH SarabunPSK"/>
+          <w:b/>
+          <w:sz w:val="28"/>
+          <w:szCs w:val="28"/>
+        </w:rPr>
+        <w:t xml:space="preserve"> </w:t>
+      </w:r>
       <w:r>
         <w:rPr>
           <w:rFonts w:ascii="TH SarabunPSK" w:hAnsi="TH SarabunPSK" w:cs="TH SarabunPSK" w:hint="cs"/>
@@ -547,6 +559,7 @@
         </w:rPr>
         <w:t>?</w:t>
       </w:r>
+      <w:proofErr w:type="gramEnd"/>
     </w:p>
     <w:p>
       <w:pPr>

</xml_diff>